<commit_message>
Manual de pruebas (debug e IIS) y hospedaje de la web en la API
- Manual_Pruebas: guía de modo debug, instalación en IIS con usuario y clave de
  SQL Server guardados como variables de entorno del grupo de aplicaciones,
  lista de pruebas manuales y scripts (publicar, configurar IIS, probar conexión,
  verificar, crear/quitar usuario SQL de permisos mínimos y consultas de control)
- La API sirve la web compilada desde wwwroot (un solo sitio en IIS): archivos
  estáticos antes del enrutamiento, recarga de rutas sin 404 y /api inexistente = 404
- Ajuste opcional Web:Carpeta; 9 pruebas nuevas del hospedaje web
- Prueba de contratos con códigos consecutivos corregida: ahora exige códigos
  distintos y crecientes (fallaba al correr en paralelo con otras pruebas)
- Documentación actualizada y Prompts

Co-Authored-By: Claude Sonnet 5.5 <noreply@anthropic.com>
</commit_message>
<xml_diff>
--- a/Prompts/3_ImplementacionFases.docx
+++ b/Prompts/3_ImplementacionFases.docx
@@ -616,6 +616,383 @@
         <w:t xml:space="preserve"> de la empresa familiar, usa como referencia esos colores y genera las interfaces que sean responsivas, intuitivas y fácil de aprender a usar para que la curva de aprendizaje no sea mucha, inicia la fase 7.</w:t>
       </w:r>
     </w:p>
+    <w:p>
+      <w:r>
+        <w:rPr>
+          <w:noProof/>
+        </w:rPr>
+        <w:drawing>
+          <wp:inline distT="0" distB="0" distL="0" distR="0" wp14:anchorId="28128F18" wp14:editId="4DF32A98">
+            <wp:extent cx="5400040" cy="2440305"/>
+            <wp:effectExtent l="0" t="0" r="0" b="0"/>
+            <wp:docPr id="1499379285" name="Imagen 1"/>
+            <wp:cNvGraphicFramePr>
+              <a:graphicFrameLocks xmlns:a="http://schemas.openxmlformats.org/drawingml/2006/main" noChangeAspect="1"/>
+            </wp:cNvGraphicFramePr>
+            <a:graphic xmlns:a="http://schemas.openxmlformats.org/drawingml/2006/main">
+              <a:graphicData uri="http://schemas.openxmlformats.org/drawingml/2006/picture">
+                <pic:pic xmlns:pic="http://schemas.openxmlformats.org/drawingml/2006/picture">
+                  <pic:nvPicPr>
+                    <pic:cNvPr id="1499379285" name=""/>
+                    <pic:cNvPicPr/>
+                  </pic:nvPicPr>
+                  <pic:blipFill>
+                    <a:blip r:embed="rId17"/>
+                    <a:stretch>
+                      <a:fillRect/>
+                    </a:stretch>
+                  </pic:blipFill>
+                  <pic:spPr>
+                    <a:xfrm>
+                      <a:off x="0" y="0"/>
+                      <a:ext cx="5400040" cy="2440305"/>
+                    </a:xfrm>
+                    <a:prstGeom prst="rect">
+                      <a:avLst/>
+                    </a:prstGeom>
+                  </pic:spPr>
+                </pic:pic>
+              </a:graphicData>
+            </a:graphic>
+          </wp:inline>
+        </w:drawing>
+      </w:r>
+    </w:p>
+    <w:p>
+      <w:r>
+        <w:rPr>
+          <w:noProof/>
+        </w:rPr>
+        <w:drawing>
+          <wp:inline distT="0" distB="0" distL="0" distR="0" wp14:anchorId="1DA44053" wp14:editId="1A74D022">
+            <wp:extent cx="5400040" cy="761365"/>
+            <wp:effectExtent l="0" t="0" r="0" b="635"/>
+            <wp:docPr id="1870500226" name="Imagen 1"/>
+            <wp:cNvGraphicFramePr>
+              <a:graphicFrameLocks xmlns:a="http://schemas.openxmlformats.org/drawingml/2006/main" noChangeAspect="1"/>
+            </wp:cNvGraphicFramePr>
+            <a:graphic xmlns:a="http://schemas.openxmlformats.org/drawingml/2006/main">
+              <a:graphicData uri="http://schemas.openxmlformats.org/drawingml/2006/picture">
+                <pic:pic xmlns:pic="http://schemas.openxmlformats.org/drawingml/2006/picture">
+                  <pic:nvPicPr>
+                    <pic:cNvPr id="1870500226" name=""/>
+                    <pic:cNvPicPr/>
+                  </pic:nvPicPr>
+                  <pic:blipFill>
+                    <a:blip r:embed="rId18"/>
+                    <a:stretch>
+                      <a:fillRect/>
+                    </a:stretch>
+                  </pic:blipFill>
+                  <pic:spPr>
+                    <a:xfrm>
+                      <a:off x="0" y="0"/>
+                      <a:ext cx="5400040" cy="761365"/>
+                    </a:xfrm>
+                    <a:prstGeom prst="rect">
+                      <a:avLst/>
+                    </a:prstGeom>
+                  </pic:spPr>
+                </pic:pic>
+              </a:graphicData>
+            </a:graphic>
+          </wp:inline>
+        </w:drawing>
+      </w:r>
+    </w:p>
+    <w:p>
+      <w:r>
+        <w:t>Lista los puntos pendientes para la segunda parte del desarrollo, las mejoras que se pueden hacer, eval</w:t>
+      </w:r>
+      <w:r>
+        <w:t>ú</w:t>
+      </w:r>
+      <w:r>
+        <w:t>a si se puede mejor la seguridad</w:t>
+      </w:r>
+      <w:r>
+        <w:t xml:space="preserve"> </w:t>
+      </w:r>
+      <w:r>
+        <w:t>actual de la aplicación y puntos de control para futuras auditorias.</w:t>
+      </w:r>
+    </w:p>
+    <w:p>
+      <w:r>
+        <w:lastRenderedPageBreak/>
+        <w:drawing>
+          <wp:inline distT="0" distB="0" distL="0" distR="0" wp14:anchorId="6E172A3F" wp14:editId="140560FC">
+            <wp:extent cx="5400040" cy="2433955"/>
+            <wp:effectExtent l="0" t="0" r="0" b="4445"/>
+            <wp:docPr id="1415191564" name="Imagen 1"/>
+            <wp:cNvGraphicFramePr>
+              <a:graphicFrameLocks xmlns:a="http://schemas.openxmlformats.org/drawingml/2006/main" noChangeAspect="1"/>
+            </wp:cNvGraphicFramePr>
+            <a:graphic xmlns:a="http://schemas.openxmlformats.org/drawingml/2006/main">
+              <a:graphicData uri="http://schemas.openxmlformats.org/drawingml/2006/picture">
+                <pic:pic xmlns:pic="http://schemas.openxmlformats.org/drawingml/2006/picture">
+                  <pic:nvPicPr>
+                    <pic:cNvPr id="1415191564" name=""/>
+                    <pic:cNvPicPr/>
+                  </pic:nvPicPr>
+                  <pic:blipFill>
+                    <a:blip r:embed="rId19"/>
+                    <a:stretch>
+                      <a:fillRect/>
+                    </a:stretch>
+                  </pic:blipFill>
+                  <pic:spPr>
+                    <a:xfrm>
+                      <a:off x="0" y="0"/>
+                      <a:ext cx="5400040" cy="2433955"/>
+                    </a:xfrm>
+                    <a:prstGeom prst="rect">
+                      <a:avLst/>
+                    </a:prstGeom>
+                  </pic:spPr>
+                </pic:pic>
+              </a:graphicData>
+            </a:graphic>
+          </wp:inline>
+        </w:drawing>
+      </w:r>
+    </w:p>
+    <w:p>
+      <w:r>
+        <w:drawing>
+          <wp:inline distT="0" distB="0" distL="0" distR="0" wp14:anchorId="3DB76F9F" wp14:editId="706B696E">
+            <wp:extent cx="5400040" cy="2006600"/>
+            <wp:effectExtent l="0" t="0" r="0" b="0"/>
+            <wp:docPr id="895921469" name="Imagen 1"/>
+            <wp:cNvGraphicFramePr>
+              <a:graphicFrameLocks xmlns:a="http://schemas.openxmlformats.org/drawingml/2006/main" noChangeAspect="1"/>
+            </wp:cNvGraphicFramePr>
+            <a:graphic xmlns:a="http://schemas.openxmlformats.org/drawingml/2006/main">
+              <a:graphicData uri="http://schemas.openxmlformats.org/drawingml/2006/picture">
+                <pic:pic xmlns:pic="http://schemas.openxmlformats.org/drawingml/2006/picture">
+                  <pic:nvPicPr>
+                    <pic:cNvPr id="895921469" name=""/>
+                    <pic:cNvPicPr/>
+                  </pic:nvPicPr>
+                  <pic:blipFill>
+                    <a:blip r:embed="rId20"/>
+                    <a:stretch>
+                      <a:fillRect/>
+                    </a:stretch>
+                  </pic:blipFill>
+                  <pic:spPr>
+                    <a:xfrm>
+                      <a:off x="0" y="0"/>
+                      <a:ext cx="5400040" cy="2006600"/>
+                    </a:xfrm>
+                    <a:prstGeom prst="rect">
+                      <a:avLst/>
+                    </a:prstGeom>
+                  </pic:spPr>
+                </pic:pic>
+              </a:graphicData>
+            </a:graphic>
+          </wp:inline>
+        </w:drawing>
+      </w:r>
+    </w:p>
+    <w:p>
+      <w:r>
+        <w:drawing>
+          <wp:inline distT="0" distB="0" distL="0" distR="0" wp14:anchorId="4D9136E8" wp14:editId="04514771">
+            <wp:extent cx="5400040" cy="2520315"/>
+            <wp:effectExtent l="0" t="0" r="0" b="0"/>
+            <wp:docPr id="1979598115" name="Imagen 1"/>
+            <wp:cNvGraphicFramePr>
+              <a:graphicFrameLocks xmlns:a="http://schemas.openxmlformats.org/drawingml/2006/main" noChangeAspect="1"/>
+            </wp:cNvGraphicFramePr>
+            <a:graphic xmlns:a="http://schemas.openxmlformats.org/drawingml/2006/main">
+              <a:graphicData uri="http://schemas.openxmlformats.org/drawingml/2006/picture">
+                <pic:pic xmlns:pic="http://schemas.openxmlformats.org/drawingml/2006/picture">
+                  <pic:nvPicPr>
+                    <pic:cNvPr id="1979598115" name=""/>
+                    <pic:cNvPicPr/>
+                  </pic:nvPicPr>
+                  <pic:blipFill>
+                    <a:blip r:embed="rId21"/>
+                    <a:stretch>
+                      <a:fillRect/>
+                    </a:stretch>
+                  </pic:blipFill>
+                  <pic:spPr>
+                    <a:xfrm>
+                      <a:off x="0" y="0"/>
+                      <a:ext cx="5400040" cy="2520315"/>
+                    </a:xfrm>
+                    <a:prstGeom prst="rect">
+                      <a:avLst/>
+                    </a:prstGeom>
+                  </pic:spPr>
+                </pic:pic>
+              </a:graphicData>
+            </a:graphic>
+          </wp:inline>
+        </w:drawing>
+      </w:r>
+    </w:p>
+    <w:p>
+      <w:r>
+        <w:drawing>
+          <wp:inline distT="0" distB="0" distL="0" distR="0" wp14:anchorId="44878D6F" wp14:editId="1618757A">
+            <wp:extent cx="5400040" cy="942340"/>
+            <wp:effectExtent l="0" t="0" r="0" b="0"/>
+            <wp:docPr id="1214069321" name="Imagen 1"/>
+            <wp:cNvGraphicFramePr>
+              <a:graphicFrameLocks xmlns:a="http://schemas.openxmlformats.org/drawingml/2006/main" noChangeAspect="1"/>
+            </wp:cNvGraphicFramePr>
+            <a:graphic xmlns:a="http://schemas.openxmlformats.org/drawingml/2006/main">
+              <a:graphicData uri="http://schemas.openxmlformats.org/drawingml/2006/picture">
+                <pic:pic xmlns:pic="http://schemas.openxmlformats.org/drawingml/2006/picture">
+                  <pic:nvPicPr>
+                    <pic:cNvPr id="1214069321" name=""/>
+                    <pic:cNvPicPr/>
+                  </pic:nvPicPr>
+                  <pic:blipFill>
+                    <a:blip r:embed="rId22"/>
+                    <a:stretch>
+                      <a:fillRect/>
+                    </a:stretch>
+                  </pic:blipFill>
+                  <pic:spPr>
+                    <a:xfrm>
+                      <a:off x="0" y="0"/>
+                      <a:ext cx="5400040" cy="942340"/>
+                    </a:xfrm>
+                    <a:prstGeom prst="rect">
+                      <a:avLst/>
+                    </a:prstGeom>
+                  </pic:spPr>
+                </pic:pic>
+              </a:graphicData>
+            </a:graphic>
+          </wp:inline>
+        </w:drawing>
+      </w:r>
+    </w:p>
+    <w:p>
+      <w:r>
+        <w:lastRenderedPageBreak/>
+        <w:drawing>
+          <wp:inline distT="0" distB="0" distL="0" distR="0" wp14:anchorId="4738B530" wp14:editId="672E57F8">
+            <wp:extent cx="5400040" cy="2218055"/>
+            <wp:effectExtent l="0" t="0" r="0" b="0"/>
+            <wp:docPr id="548522044" name="Imagen 1"/>
+            <wp:cNvGraphicFramePr>
+              <a:graphicFrameLocks xmlns:a="http://schemas.openxmlformats.org/drawingml/2006/main" noChangeAspect="1"/>
+            </wp:cNvGraphicFramePr>
+            <a:graphic xmlns:a="http://schemas.openxmlformats.org/drawingml/2006/main">
+              <a:graphicData uri="http://schemas.openxmlformats.org/drawingml/2006/picture">
+                <pic:pic xmlns:pic="http://schemas.openxmlformats.org/drawingml/2006/picture">
+                  <pic:nvPicPr>
+                    <pic:cNvPr id="548522044" name=""/>
+                    <pic:cNvPicPr/>
+                  </pic:nvPicPr>
+                  <pic:blipFill>
+                    <a:blip r:embed="rId23"/>
+                    <a:stretch>
+                      <a:fillRect/>
+                    </a:stretch>
+                  </pic:blipFill>
+                  <pic:spPr>
+                    <a:xfrm>
+                      <a:off x="0" y="0"/>
+                      <a:ext cx="5400040" cy="2218055"/>
+                    </a:xfrm>
+                    <a:prstGeom prst="rect">
+                      <a:avLst/>
+                    </a:prstGeom>
+                  </pic:spPr>
+                </pic:pic>
+              </a:graphicData>
+            </a:graphic>
+          </wp:inline>
+        </w:drawing>
+      </w:r>
+    </w:p>
+    <w:p>
+      <w:r>
+        <w:drawing>
+          <wp:inline distT="0" distB="0" distL="0" distR="0" wp14:anchorId="5F41D8A2" wp14:editId="40CE226F">
+            <wp:extent cx="5400040" cy="807085"/>
+            <wp:effectExtent l="0" t="0" r="0" b="0"/>
+            <wp:docPr id="503531567" name="Imagen 1"/>
+            <wp:cNvGraphicFramePr>
+              <a:graphicFrameLocks xmlns:a="http://schemas.openxmlformats.org/drawingml/2006/main" noChangeAspect="1"/>
+            </wp:cNvGraphicFramePr>
+            <a:graphic xmlns:a="http://schemas.openxmlformats.org/drawingml/2006/main">
+              <a:graphicData uri="http://schemas.openxmlformats.org/drawingml/2006/picture">
+                <pic:pic xmlns:pic="http://schemas.openxmlformats.org/drawingml/2006/picture">
+                  <pic:nvPicPr>
+                    <pic:cNvPr id="503531567" name=""/>
+                    <pic:cNvPicPr/>
+                  </pic:nvPicPr>
+                  <pic:blipFill>
+                    <a:blip r:embed="rId24"/>
+                    <a:stretch>
+                      <a:fillRect/>
+                    </a:stretch>
+                  </pic:blipFill>
+                  <pic:spPr>
+                    <a:xfrm>
+                      <a:off x="0" y="0"/>
+                      <a:ext cx="5400040" cy="807085"/>
+                    </a:xfrm>
+                    <a:prstGeom prst="rect">
+                      <a:avLst/>
+                    </a:prstGeom>
+                  </pic:spPr>
+                </pic:pic>
+              </a:graphicData>
+            </a:graphic>
+          </wp:inline>
+        </w:drawing>
+      </w:r>
+    </w:p>
+    <w:p>
+      <w:r>
+        <w:drawing>
+          <wp:inline distT="0" distB="0" distL="0" distR="0" wp14:anchorId="4C6F34A7" wp14:editId="6D0C4A12">
+            <wp:extent cx="5400040" cy="916940"/>
+            <wp:effectExtent l="0" t="0" r="0" b="0"/>
+            <wp:docPr id="1911441263" name="Imagen 1"/>
+            <wp:cNvGraphicFramePr>
+              <a:graphicFrameLocks xmlns:a="http://schemas.openxmlformats.org/drawingml/2006/main" noChangeAspect="1"/>
+            </wp:cNvGraphicFramePr>
+            <a:graphic xmlns:a="http://schemas.openxmlformats.org/drawingml/2006/main">
+              <a:graphicData uri="http://schemas.openxmlformats.org/drawingml/2006/picture">
+                <pic:pic xmlns:pic="http://schemas.openxmlformats.org/drawingml/2006/picture">
+                  <pic:nvPicPr>
+                    <pic:cNvPr id="1911441263" name=""/>
+                    <pic:cNvPicPr/>
+                  </pic:nvPicPr>
+                  <pic:blipFill>
+                    <a:blip r:embed="rId25"/>
+                    <a:stretch>
+                      <a:fillRect/>
+                    </a:stretch>
+                  </pic:blipFill>
+                  <pic:spPr>
+                    <a:xfrm>
+                      <a:off x="0" y="0"/>
+                      <a:ext cx="5400040" cy="916940"/>
+                    </a:xfrm>
+                    <a:prstGeom prst="rect">
+                      <a:avLst/>
+                    </a:prstGeom>
+                  </pic:spPr>
+                </pic:pic>
+              </a:graphicData>
+            </a:graphic>
+          </wp:inline>
+        </w:drawing>
+      </w:r>
+    </w:p>
+    <w:p/>
     <w:p/>
     <w:p/>
     <w:sectPr>

</xml_diff>